<commit_message>
Physics HW: Dano/Najti/Reshenie format for test tasks
Co-Authored-By: Claude Sonnet 5.5 <noreply@anthropic.com>
Claude-Session: https://claude.ai/code/session_015pxcmtSSTrkw1u4zvhxRCP
</commit_message>
<xml_diff>
--- a/Physics/DZ_Kolebaniya.docx
+++ b/Physics/DZ_Kolebaniya.docx
@@ -465,6 +465,64 @@
         <w:rPr>
           <w:b/>
         </w:rPr>
+        <w:t xml:space="preserve">Дано: </w:t>
+      </w:r>
+      <w:r/>
+    </w:p>
+    <w:p>
+      <w:pPr>
+        <w:spacing w:after="40"/>
+      </w:pPr>
+      <w:r>
+        <w:t xml:space="preserve">    А – поперечные волны в газах</w:t>
+      </w:r>
+    </w:p>
+    <w:p>
+      <w:pPr>
+        <w:spacing w:after="40"/>
+      </w:pPr>
+      <w:r>
+        <w:t xml:space="preserve">    Б – механические волны в вакууме</w:t>
+      </w:r>
+    </w:p>
+    <w:p>
+      <w:pPr>
+        <w:spacing w:after="40"/>
+      </w:pPr>
+      <w:r>
+        <w:t xml:space="preserve">    В – волны бывают поперечными и продольными</w:t>
+      </w:r>
+    </w:p>
+    <w:p>
+      <w:pPr>
+        <w:spacing w:after="40"/>
+      </w:pPr>
+      <w:r>
+        <w:t xml:space="preserve">    Г – поперечные волны в твердом теле</w:t>
+      </w:r>
+    </w:p>
+    <w:p>
+      <w:pPr>
+        <w:spacing w:after="40"/>
+      </w:pPr>
+      <w:r>
+        <w:rPr>
+          <w:b/>
+        </w:rPr>
+        <w:t xml:space="preserve">Найти: </w:t>
+      </w:r>
+      <w:r>
+        <w:t>неверное утверждение</w:t>
+      </w:r>
+    </w:p>
+    <w:p>
+      <w:pPr>
+        <w:spacing w:after="40"/>
+      </w:pPr>
+      <w:r>
+        <w:rPr>
+          <w:b/>
+        </w:rPr>
         <w:t>Решение.</w:t>
       </w:r>
       <w:r/>
@@ -539,6 +597,56 @@
         <w:rPr>
           <w:b/>
         </w:rPr>
+        <w:t xml:space="preserve">Дано: </w:t>
+      </w:r>
+      <w:r/>
+    </w:p>
+    <w:p>
+      <w:pPr>
+        <w:spacing w:after="40"/>
+      </w:pPr>
+      <w:r>
+        <w:t xml:space="preserve">    математический маятник, малые колебания</w:t>
+      </w:r>
+    </w:p>
+    <w:p>
+      <w:pPr>
+        <w:spacing w:after="40"/>
+      </w:pPr>
+      <w:r>
+        <w:t xml:space="preserve">    сила притяжения к Земле, сопротивлением воздуха пренебречь</w:t>
+      </w:r>
+    </w:p>
+    <w:p>
+      <w:pPr>
+        <w:spacing w:after="40"/>
+      </w:pPr>
+      <w:r>
+        <w:t xml:space="preserve">    M и R Земли известны</w:t>
+      </w:r>
+    </w:p>
+    <w:p>
+      <w:pPr>
+        <w:spacing w:after="40"/>
+      </w:pPr>
+      <w:r>
+        <w:rPr>
+          <w:b/>
+        </w:rPr>
+        <w:t xml:space="preserve">Найти: </w:t>
+      </w:r>
+      <w:r>
+        <w:t>какие величины надо измерить, чтобы найти G</w:t>
+      </w:r>
+    </w:p>
+    <w:p>
+      <w:pPr>
+        <w:spacing w:after="40"/>
+      </w:pPr>
+      <w:r>
+        <w:rPr>
+          <w:b/>
+        </w:rPr>
         <w:t>Решение.</w:t>
       </w:r>
       <w:r/>
@@ -613,6 +721,48 @@
         <w:rPr>
           <w:b/>
         </w:rPr>
+        <w:t xml:space="preserve">Дано: </w:t>
+      </w:r>
+      <w:r/>
+    </w:p>
+    <w:p>
+      <w:pPr>
+        <w:spacing w:after="40"/>
+      </w:pPr>
+      <w:r>
+        <w:t xml:space="preserve">    y = 0,05·e^(–2t)·sin(1000t – 2x), м</w:t>
+      </w:r>
+    </w:p>
+    <w:p>
+      <w:pPr>
+        <w:spacing w:after="40"/>
+      </w:pPr>
+      <w:r>
+        <w:t xml:space="preserve">    А: υ = 500 м/с;  Б: волна затухающая;  В: амплитуда меняется со временем;  Г: волна плоская</w:t>
+      </w:r>
+    </w:p>
+    <w:p>
+      <w:pPr>
+        <w:spacing w:after="40"/>
+      </w:pPr>
+      <w:r>
+        <w:rPr>
+          <w:b/>
+        </w:rPr>
+        <w:t xml:space="preserve">Найти: </w:t>
+      </w:r>
+      <w:r>
+        <w:t>верные утверждения</w:t>
+      </w:r>
+    </w:p>
+    <w:p>
+      <w:pPr>
+        <w:spacing w:after="40"/>
+      </w:pPr>
+      <w:r>
+        <w:rPr>
+          <w:b/>
+        </w:rPr>
         <w:t>Решение.</w:t>
       </w:r>
       <w:r/>
@@ -1028,6 +1178,14 @@
         <w:spacing w:after="40"/>
       </w:pPr>
       <w:r>
+        <w:t xml:space="preserve">    сравнить L с 0,5 Гн</w:t>
+      </w:r>
+    </w:p>
+    <w:p>
+      <w:pPr>
+        <w:spacing w:after="40"/>
+      </w:pPr>
+      <w:r>
         <w:rPr>
           <w:b/>
         </w:rPr>
@@ -1117,6 +1275,48 @@
       </w:r>
       <w:r>
         <w:t>Добротность последовательного RLC-контура: А. не зависит от его индуктивности; Б. зависит от его электрической емкости; В. может быть равна 20; Г. является безразмерной физической величиной.</w:t>
+      </w:r>
+    </w:p>
+    <w:p>
+      <w:pPr>
+        <w:spacing w:after="40"/>
+      </w:pPr>
+      <w:r>
+        <w:rPr>
+          <w:b/>
+        </w:rPr>
+        <w:t xml:space="preserve">Дано: </w:t>
+      </w:r>
+      <w:r/>
+    </w:p>
+    <w:p>
+      <w:pPr>
+        <w:spacing w:after="40"/>
+      </w:pPr>
+      <w:r>
+        <w:t xml:space="preserve">    последовательный RLC-контур</w:t>
+      </w:r>
+    </w:p>
+    <w:p>
+      <w:pPr>
+        <w:spacing w:after="40"/>
+      </w:pPr>
+      <w:r>
+        <w:t xml:space="preserve">    А: Q не зависит от L;  Б: Q зависит от C;  В: Q может быть равна 20;  Г: Q безразмерна</w:t>
+      </w:r>
+    </w:p>
+    <w:p>
+      <w:pPr>
+        <w:spacing w:after="40"/>
+      </w:pPr>
+      <w:r>
+        <w:rPr>
+          <w:b/>
+        </w:rPr>
+        <w:t xml:space="preserve">Найти: </w:t>
+      </w:r>
+      <w:r>
+        <w:t>верные утверждения</w:t>
       </w:r>
     </w:p>
     <w:p>

</xml_diff>